<commit_message>
docs: fix prompt mapping, static contents in Word files, add questionnaire + workflows
Co-Authored-By: Claude Opus 5.5 <noreply@anthropic.com>
</commit_message>
<xml_diff>
--- a/docs/project/word/AGENTS.docx
+++ b/docs/project/word/AGENTS.docx
@@ -11,12 +11,237 @@
       </w:r>
     </w:p>
     <w:p>
-      <w:r>
-        <w:fldChar w:fldCharType="begin"/>
-        <w:instrText xml:space="preserve">TOC \o "1-3" \h \z \u</w:instrText>
-        <w:fldChar w:fldCharType="separate"/>
-        <w:t>Table of contents (right-click, Update Field)</w:t>
-        <w:fldChar w:fldCharType="end"/>
+      <w:pPr>
+        <w:spacing w:after="40"/>
+        <w:ind w:left="0"/>
+      </w:pPr>
+      <w:r>
+        <w:rPr>
+          <w:b/>
+          <w:sz w:val="21"/>
+        </w:rPr>
+        <w:t>Contents</w:t>
+      </w:r>
+    </w:p>
+    <w:p>
+      <w:pPr>
+        <w:spacing w:after="40"/>
+        <w:ind w:left="0"/>
+      </w:pPr>
+      <w:r>
+        <w:rPr>
+          <w:b/>
+          <w:sz w:val="21"/>
+        </w:rPr>
+        <w:t>AGENTS.md - coding rules for the Helm repo</w:t>
+      </w:r>
+    </w:p>
+    <w:p>
+      <w:pPr>
+        <w:spacing w:after="40"/>
+        <w:ind w:left="397"/>
+      </w:pPr>
+      <w:r>
+        <w:rPr>
+          <w:b w:val="0"/>
+          <w:sz w:val="19"/>
+        </w:rPr>
+        <w:t>0. The top rule: zero data loss</w:t>
+      </w:r>
+    </w:p>
+    <w:p>
+      <w:pPr>
+        <w:spacing w:after="40"/>
+        <w:ind w:left="397"/>
+      </w:pPr>
+      <w:r>
+        <w:rPr>
+          <w:b w:val="0"/>
+          <w:sz w:val="19"/>
+        </w:rPr>
+        <w:t>1. Inspect before you change</w:t>
+      </w:r>
+    </w:p>
+    <w:p>
+      <w:pPr>
+        <w:spacing w:after="40"/>
+        <w:ind w:left="397"/>
+      </w:pPr>
+      <w:r>
+        <w:rPr>
+          <w:b w:val="0"/>
+          <w:sz w:val="19"/>
+        </w:rPr>
+        <w:t>2. Vanilla JS patterns</w:t>
+      </w:r>
+    </w:p>
+    <w:p>
+      <w:pPr>
+        <w:spacing w:after="40"/>
+        <w:ind w:left="397"/>
+      </w:pPr>
+      <w:r>
+        <w:rPr>
+          <w:b w:val="0"/>
+          <w:sz w:val="19"/>
+        </w:rPr>
+        <w:t>3. Naming</w:t>
+      </w:r>
+    </w:p>
+    <w:p>
+      <w:pPr>
+        <w:spacing w:after="40"/>
+        <w:ind w:left="397"/>
+      </w:pPr>
+      <w:r>
+        <w:rPr>
+          <w:b w:val="0"/>
+          <w:sz w:val="19"/>
+        </w:rPr>
+        <w:t>4. Folder structure</w:t>
+      </w:r>
+    </w:p>
+    <w:p>
+      <w:pPr>
+        <w:spacing w:after="40"/>
+        <w:ind w:left="397"/>
+      </w:pPr>
+      <w:r>
+        <w:rPr>
+          <w:b w:val="0"/>
+          <w:sz w:val="19"/>
+        </w:rPr>
+        <w:t>5. Reuse components</w:t>
+      </w:r>
+    </w:p>
+    <w:p>
+      <w:pPr>
+        <w:spacing w:after="40"/>
+        <w:ind w:left="397"/>
+      </w:pPr>
+      <w:r>
+        <w:rPr>
+          <w:b w:val="0"/>
+          <w:sz w:val="19"/>
+        </w:rPr>
+        <w:t>6. No new dependencies</w:t>
+      </w:r>
+    </w:p>
+    <w:p>
+      <w:pPr>
+        <w:spacing w:after="40"/>
+        <w:ind w:left="397"/>
+      </w:pPr>
+      <w:r>
+        <w:rPr>
+          <w:b w:val="0"/>
+          <w:sz w:val="19"/>
+        </w:rPr>
+        <w:t>7. Error handling</w:t>
+      </w:r>
+    </w:p>
+    <w:p>
+      <w:pPr>
+        <w:spacing w:after="40"/>
+        <w:ind w:left="397"/>
+      </w:pPr>
+      <w:r>
+        <w:rPr>
+          <w:b w:val="0"/>
+          <w:sz w:val="19"/>
+        </w:rPr>
+        <w:t>8. Security and secrets</w:t>
+      </w:r>
+    </w:p>
+    <w:p>
+      <w:pPr>
+        <w:spacing w:after="40"/>
+        <w:ind w:left="397"/>
+      </w:pPr>
+      <w:r>
+        <w:rPr>
+          <w:b w:val="0"/>
+          <w:sz w:val="19"/>
+        </w:rPr>
+        <w:t>9. DB and API access: BPStore and RPC</w:t>
+      </w:r>
+    </w:p>
+    <w:p>
+      <w:pPr>
+        <w:spacing w:after="40"/>
+        <w:ind w:left="397"/>
+      </w:pPr>
+      <w:r>
+        <w:rPr>
+          <w:b w:val="0"/>
+          <w:sz w:val="19"/>
+        </w:rPr>
+        <w:t>10. CSP and asset versioning</w:t>
+      </w:r>
+    </w:p>
+    <w:p>
+      <w:pPr>
+        <w:spacing w:after="40"/>
+        <w:ind w:left="397"/>
+      </w:pPr>
+      <w:r>
+        <w:rPr>
+          <w:b w:val="0"/>
+          <w:sz w:val="19"/>
+        </w:rPr>
+        <w:t>11. Migrations</w:t>
+      </w:r>
+    </w:p>
+    <w:p>
+      <w:pPr>
+        <w:spacing w:after="40"/>
+        <w:ind w:left="397"/>
+      </w:pPr>
+      <w:r>
+        <w:rPr>
+          <w:b w:val="0"/>
+          <w:sz w:val="19"/>
+        </w:rPr>
+        <w:t>12. Testing</w:t>
+      </w:r>
+    </w:p>
+    <w:p>
+      <w:pPr>
+        <w:spacing w:after="40"/>
+        <w:ind w:left="397"/>
+      </w:pPr>
+      <w:r>
+        <w:rPr>
+          <w:b w:val="0"/>
+          <w:sz w:val="19"/>
+        </w:rPr>
+        <w:t>13. Docs</w:t>
+      </w:r>
+    </w:p>
+    <w:p>
+      <w:pPr>
+        <w:spacing w:after="40"/>
+        <w:ind w:left="397"/>
+      </w:pPr>
+      <w:r>
+        <w:rPr>
+          <w:b w:val="0"/>
+          <w:sz w:val="19"/>
+        </w:rPr>
+        <w:t>14. Git discipline</w:t>
+      </w:r>
+    </w:p>
+    <w:p>
+      <w:pPr>
+        <w:spacing w:after="40"/>
+        <w:ind w:left="397"/>
+      </w:pPr>
+      <w:r>
+        <w:rPr>
+          <w:b w:val="0"/>
+          <w:sz w:val="19"/>
+        </w:rPr>
+        <w:t>15. Product defaults you must keep</w:t>
       </w:r>
     </w:p>
     <w:p>

</xml_diff>